<commit_message>
Draft_006: restore SOP verbatim from Draft_005
</commit_message>
<xml_diff>
--- a/thesis/003_ThesisProposal_Draft_006.docx
+++ b/thesis/003_ThesisProposal_Draft_006.docx
@@ -1143,7 +1143,7 @@
           <w:i w:val="0"/>
           <w:sz w:val="22"/>
         </w:rPr>
-        <w:t xml:space="preserve"/>
+        <w:t xml:space="preserve">Academic writing in the applied life sciences requires a discipline-specific management of uncertainty. However, current understanding of how Philippine developing researchers navigate these conventions remains limited. While previous studies have established that expert hedging varies significantly across fields such as Agriculture and Biology, there is a lack of empirical data on whether developing researchers at PSAU reflect these disciplinary distinctions in their abstracts. The absence of a local corpus baseline creates a gap in understanding. It remains unclear whether the thesis abstracts produced in these applied sciences reflect the field-specific rhetorical norms expected of them, or if they rely on a generic, undifferentiated approach to hedging.</w:t>
       </w:r>
     </w:p>
     <w:p>
@@ -1159,7 +1159,7 @@
           <w:i w:val="0"/>
           <w:sz w:val="22"/>
         </w:rPr>
-        <w:t xml:space="preserve">Academic writing in the applied life sciences requires discipline-sensitive management of uncertainty. Prior work shows that expert hedging varies across fields such as agriculture and the basic sciences, yet there is no local corpus baseline for whether developing researchers at PSAU reflect those distinctions in their abstracts—or whether they rely on a generic, undifferentiated approach.</w:t>
+        <w:t xml:space="preserve">This study addresses that gap by mapping hedging patterns in undergraduate thesis abstracts from three disciplines at PSAU. Generally, it examines how epistemic stance is constructed through hedging patterns in undergraduate thesis abstracts across Agriculture, Veterinary Medicine, and Biology. Specifically, it aims to answer the following questions:</w:t>
       </w:r>
     </w:p>
     <w:p>

</xml_diff>

<commit_message>
Draft_006: tightened SOP framing; research questions stay verbatim
</commit_message>
<xml_diff>
--- a/thesis/003_ThesisProposal_Draft_006.docx
+++ b/thesis/003_ThesisProposal_Draft_006.docx
@@ -1143,7 +1143,7 @@
           <w:i w:val="0"/>
           <w:sz w:val="22"/>
         </w:rPr>
-        <w:t xml:space="preserve">Academic writing in the applied life sciences requires a discipline-specific management of uncertainty. However, current understanding of how Philippine developing researchers navigate these conventions remains limited. While previous studies have established that expert hedging varies significantly across fields such as Agriculture and Biology, there is a lack of empirical data on whether developing researchers at PSAU reflect these disciplinary distinctions in their abstracts. The absence of a local corpus baseline creates a gap in understanding. It remains unclear whether the thesis abstracts produced in these applied sciences reflect the field-specific rhetorical norms expected of them, or if they rely on a generic, undifferentiated approach to hedging.</w:t>
+        <w:t xml:space="preserve">Academic writing in the applied life sciences requires discipline-sensitive management of uncertainty. Prior work shows that expert hedging varies across fields such as agriculture and the basic sciences, yet there is no local corpus baseline for whether developing researchers at PSAU reflect those distinctions in their abstracts—or whether they rely on a generic, undifferentiated approach.</w:t>
       </w:r>
     </w:p>
     <w:p>
@@ -1159,7 +1159,7 @@
           <w:i w:val="0"/>
           <w:sz w:val="22"/>
         </w:rPr>
-        <w:t xml:space="preserve">This study addresses that gap by mapping hedging patterns in undergraduate thesis abstracts from three disciplines at PSAU. Generally, it examines how epistemic stance is constructed through hedging patterns in undergraduate thesis abstracts across Agriculture, Veterinary Medicine, and Biology. Specifically, it aims to answer the following questions:</w:t>
+        <w:t xml:space="preserve">This study maps hedging patterns in undergraduate thesis abstracts from Agriculture, Veterinary Medicine, and Biology at PSAU. It asks:</w:t>
       </w:r>
     </w:p>
     <w:p>

</xml_diff>